<commit_message>
fix(docx): keep a note's story whole across its border lines
</commit_message>
<xml_diff>
--- a/crates/docx-edit/tests/fixtures/footnote-anchor.docx
+++ b/crates/docx-edit/tests/fixtures/footnote-anchor.docx
@@ -12,6 +12,15 @@
         </w:rPr>
         <w:footnoteReference w:id="2"/>
       </w:r>
+      <w:r>
+        <w:t xml:space="preserve"> and an aside</w:t>
+      </w:r>
+      <w:r>
+        <w:rPr>
+          <w:vertAlign w:val="superscript"/>
+        </w:rPr>
+        <w:endnoteReference w:id="3"/>
+      </w:r>
     </w:p>
     <w:sectPr>
       <w:pgSz w:w="12240" w:h="15840"/>
@@ -19,6 +28,38 @@
     </w:sectPr>
   </w:body>
 </w:document>
+</file>
+
+<file path=word/endnotes.xml><?xml version="1.0" encoding="utf-8"?>
+<w:endnotes xmlns:w="http://schemas.openxmlformats.org/wordprocessingml/2006/main">
+  <w:endnote w:id="-1" w:type="separator">
+    <w:p>
+      <w:r>
+        <w:separator/>
+      </w:r>
+    </w:p>
+  </w:endnote>
+  <w:endnote w:id="0" w:type="continuationSeparator">
+    <w:p>
+      <w:r>
+        <w:continuationSeparator/>
+      </w:r>
+    </w:p>
+  </w:endnote>
+  <w:endnote w:id="3">
+    <w:p>
+      <w:r>
+        <w:rPr>
+          <w:vertAlign w:val="superscript"/>
+        </w:rPr>
+        <w:endnoteRef/>
+      </w:r>
+      <w:r>
+        <w:t xml:space="preserve"> Aside body text</w:t>
+      </w:r>
+    </w:p>
+  </w:endnote>
+</w:endnotes>
 </file>
 
 <file path=word/footnotes.xml><?xml version="1.0" encoding="utf-8"?>

</xml_diff>